<commit_message>
feat(routing_algorithms): add a_star_need_report to quantify where a heuristic would help
- Add a_star_need_report.py: runs cut_dijkstra on every directed entrance
  pair (~250k pairs) and writes dijkstra_report.txt with columns
  source_name, target_name, proportion, source_id, target_id,
  cut_iterations, path_vertices, optimum_weight, path, sorted by ascending
  proportion. Proportion = path_vertices / cut_iterations: close to 1
  means Dijkstra is already near-optimal for that route; close to 0 is
  where a heuristic would reduce the most unnecessary extractions
- Move build_graph_from_weights from dijkstra.py into algorithms_utils.py
  so a_star_need_report.py can import it without going through dijkstra.py
- Add NodeFmt type alias to algorithms_utils.py for the shared
  Callable[[Node], str] signature used by node_fmt across both files
- Rename the empty a_star_need.py placeholder to a_star_need_report.py
- Update scripts/from_txt_to_xlsx.py and dijkstra.py imports accordingly
</commit_message>
<xml_diff>
--- a/.work/06.27.docx
+++ b/.work/06.27.docx
@@ -2969,7 +2969,19 @@
         <w:rPr>
           <w:rFonts w:ascii="Arial" w:hAnsi="Arial" w:cs="Arial"/>
         </w:rPr>
-        <w:t>Maybe called dijkstra_report.txt</w:t>
+        <w:t xml:space="preserve">Maybe </w:t>
+      </w:r>
+      <w:r>
+        <w:rPr>
+          <w:rFonts w:ascii="Arial" w:hAnsi="Arial" w:cs="Arial"/>
+        </w:rPr>
+        <w:t xml:space="preserve">output </w:t>
+      </w:r>
+      <w:r>
+        <w:rPr>
+          <w:rFonts w:ascii="Arial" w:hAnsi="Arial" w:cs="Arial"/>
+        </w:rPr>
+        <w:t>called dijkstra_report.txt</w:t>
       </w:r>
     </w:p>
     <w:p>
@@ -2981,12 +2993,565 @@
         </w:numPr>
         <w:rPr>
           <w:rFonts w:ascii="Arial" w:hAnsi="Arial" w:cs="Arial"/>
-        </w:rPr>
-      </w:pPr>
-      <w:r>
-        <w:rPr>
-          <w:rFonts w:ascii="Arial" w:hAnsi="Arial" w:cs="Arial"/>
-        </w:rPr>
+          <w:lang w:val="en-GB"/>
+        </w:rPr>
+      </w:pPr>
+      <w:proofErr w:type="spellStart"/>
+      <w:r>
+        <w:rPr>
+          <w:rFonts w:ascii="Arial" w:hAnsi="Arial" w:cs="Arial"/>
+          <w:lang w:val="en-GB"/>
+        </w:rPr>
+        <w:t>Afegir</w:t>
+      </w:r>
+      <w:proofErr w:type="spellEnd"/>
+      <w:r>
+        <w:rPr>
+          <w:rFonts w:ascii="Arial" w:hAnsi="Arial" w:cs="Arial"/>
+          <w:lang w:val="en-GB"/>
+        </w:rPr>
+        <w:t xml:space="preserve"> nom target </w:t>
+      </w:r>
+      <w:proofErr w:type="spellStart"/>
+      <w:r>
+        <w:rPr>
+          <w:rFonts w:ascii="Arial" w:hAnsi="Arial" w:cs="Arial"/>
+          <w:lang w:val="en-GB"/>
+        </w:rPr>
+        <w:t>i</w:t>
+      </w:r>
+      <w:proofErr w:type="spellEnd"/>
+      <w:r>
+        <w:rPr>
+          <w:rFonts w:ascii="Arial" w:hAnsi="Arial" w:cs="Arial"/>
+          <w:lang w:val="en-GB"/>
+        </w:rPr>
+        <w:t xml:space="preserve"> source</w:t>
+      </w:r>
+    </w:p>
+    <w:p>
+      <w:pPr>
+        <w:pStyle w:val="ListParagraph"/>
+        <w:numPr>
+          <w:ilvl w:val="1"/>
+          <w:numId w:val="1"/>
+        </w:numPr>
+        <w:rPr>
+          <w:rFonts w:ascii="Arial" w:hAnsi="Arial" w:cs="Arial"/>
+          <w:lang w:val="es-ES"/>
+        </w:rPr>
+      </w:pPr>
+      <w:r>
+        <w:rPr>
+          <w:rFonts w:ascii="Arial" w:hAnsi="Arial" w:cs="Arial"/>
+          <w:lang w:val="es-ES"/>
+        </w:rPr>
+        <w:t xml:space="preserve">Si </w:t>
+      </w:r>
+      <w:proofErr w:type="spellStart"/>
+      <w:r>
+        <w:rPr>
+          <w:rFonts w:ascii="Arial" w:hAnsi="Arial" w:cs="Arial"/>
+          <w:lang w:val="es-ES"/>
+        </w:rPr>
+        <w:t>path</w:t>
+      </w:r>
+      <w:proofErr w:type="spellEnd"/>
+      <w:r>
+        <w:rPr>
+          <w:rFonts w:ascii="Arial" w:hAnsi="Arial" w:cs="Arial"/>
+          <w:lang w:val="es-ES"/>
+        </w:rPr>
+        <w:t xml:space="preserve"> es </w:t>
+      </w:r>
+      <w:proofErr w:type="spellStart"/>
+      <w:r>
+        <w:rPr>
+          <w:rFonts w:ascii="Arial" w:hAnsi="Arial" w:cs="Arial"/>
+          <w:lang w:val="es-ES"/>
+        </w:rPr>
+        <w:t>none</w:t>
+      </w:r>
+      <w:proofErr w:type="spellEnd"/>
+      <w:r>
+        <w:rPr>
+          <w:rFonts w:ascii="Arial" w:hAnsi="Arial" w:cs="Arial"/>
+          <w:lang w:val="es-ES"/>
+        </w:rPr>
+        <w:t xml:space="preserve"> </w:t>
+      </w:r>
+      <w:proofErr w:type="spellStart"/>
+      <w:r>
+        <w:rPr>
+          <w:rFonts w:ascii="Arial" w:hAnsi="Arial" w:cs="Arial"/>
+          <w:lang w:val="es-ES"/>
+        </w:rPr>
+        <w:t>printejar</w:t>
+      </w:r>
+      <w:proofErr w:type="spellEnd"/>
+      <w:r>
+        <w:rPr>
+          <w:rFonts w:ascii="Arial" w:hAnsi="Arial" w:cs="Arial"/>
+          <w:lang w:val="es-ES"/>
+        </w:rPr>
+        <w:t xml:space="preserve"> </w:t>
+      </w:r>
+      <w:proofErr w:type="spellStart"/>
+      <w:r>
+        <w:rPr>
+          <w:rFonts w:ascii="Arial" w:hAnsi="Arial" w:cs="Arial"/>
+          <w:lang w:val="es-ES"/>
+        </w:rPr>
+        <w:t>none</w:t>
+      </w:r>
+      <w:proofErr w:type="spellEnd"/>
+      <w:r>
+        <w:rPr>
+          <w:rFonts w:ascii="Arial" w:hAnsi="Arial" w:cs="Arial"/>
+          <w:lang w:val="es-ES"/>
+        </w:rPr>
+        <w:t xml:space="preserve"> al </w:t>
+      </w:r>
+      <w:proofErr w:type="spellStart"/>
+      <w:r>
+        <w:rPr>
+          <w:rFonts w:ascii="Arial" w:hAnsi="Arial" w:cs="Arial"/>
+          <w:lang w:val="es-ES"/>
+        </w:rPr>
+        <w:t>path</w:t>
+      </w:r>
+      <w:proofErr w:type="spellEnd"/>
+    </w:p>
+    <w:p>
+      <w:pPr>
+        <w:pStyle w:val="ListParagraph"/>
+        <w:numPr>
+          <w:ilvl w:val="1"/>
+          <w:numId w:val="1"/>
+        </w:numPr>
+        <w:rPr>
+          <w:rFonts w:ascii="Arial" w:hAnsi="Arial" w:cs="Arial"/>
+          <w:lang w:val="es-ES"/>
+        </w:rPr>
+      </w:pPr>
+      <w:r>
+        <w:rPr>
+          <w:rFonts w:ascii="Arial" w:hAnsi="Arial" w:cs="Arial"/>
+          <w:lang w:val="es-ES"/>
+        </w:rPr>
+        <w:t xml:space="preserve">A la </w:t>
+      </w:r>
+      <w:proofErr w:type="spellStart"/>
+      <w:r>
+        <w:rPr>
+          <w:rFonts w:ascii="Arial" w:hAnsi="Arial" w:cs="Arial"/>
+          <w:lang w:val="es-ES"/>
+        </w:rPr>
+        <w:t>proportion</w:t>
+      </w:r>
+      <w:proofErr w:type="spellEnd"/>
+      <w:r>
+        <w:rPr>
+          <w:rFonts w:ascii="Arial" w:hAnsi="Arial" w:cs="Arial"/>
+          <w:lang w:val="es-ES"/>
+        </w:rPr>
+        <w:t xml:space="preserve"> posar NA o algo </w:t>
+      </w:r>
+      <w:proofErr w:type="spellStart"/>
+      <w:r>
+        <w:rPr>
+          <w:rFonts w:ascii="Arial" w:hAnsi="Arial" w:cs="Arial"/>
+          <w:lang w:val="es-ES"/>
+        </w:rPr>
+        <w:t>aixi</w:t>
+      </w:r>
+      <w:proofErr w:type="spellEnd"/>
+    </w:p>
+    <w:p>
+      <w:pPr>
+        <w:pStyle w:val="ListParagraph"/>
+        <w:numPr>
+          <w:ilvl w:val="1"/>
+          <w:numId w:val="1"/>
+        </w:numPr>
+        <w:rPr>
+          <w:rFonts w:ascii="Arial" w:hAnsi="Arial" w:cs="Arial"/>
+          <w:lang w:val="es-ES"/>
+        </w:rPr>
+      </w:pPr>
+      <w:r>
+        <w:rPr>
+          <w:rFonts w:ascii="Arial" w:hAnsi="Arial" w:cs="Arial"/>
+          <w:lang w:val="es-ES"/>
+        </w:rPr>
+        <w:t xml:space="preserve">Ordenar les files per </w:t>
+      </w:r>
+      <w:proofErr w:type="spellStart"/>
+      <w:r>
+        <w:rPr>
+          <w:rFonts w:ascii="Arial" w:hAnsi="Arial" w:cs="Arial"/>
+          <w:lang w:val="es-ES"/>
+        </w:rPr>
+        <w:t>proportion</w:t>
+      </w:r>
+      <w:proofErr w:type="spellEnd"/>
+      <w:r>
+        <w:rPr>
+          <w:rFonts w:ascii="Arial" w:hAnsi="Arial" w:cs="Arial"/>
+          <w:lang w:val="es-ES"/>
+        </w:rPr>
+        <w:t xml:space="preserve"> de </w:t>
+      </w:r>
+      <w:proofErr w:type="spellStart"/>
+      <w:r>
+        <w:rPr>
+          <w:rFonts w:ascii="Arial" w:hAnsi="Arial" w:cs="Arial"/>
+          <w:lang w:val="es-ES"/>
+        </w:rPr>
+        <w:t>desc</w:t>
+      </w:r>
+      <w:proofErr w:type="spellEnd"/>
+      <w:r>
+        <w:rPr>
+          <w:rFonts w:ascii="Arial" w:hAnsi="Arial" w:cs="Arial"/>
+          <w:lang w:val="es-ES"/>
+        </w:rPr>
+        <w:t xml:space="preserve"> a </w:t>
+      </w:r>
+      <w:proofErr w:type="spellStart"/>
+      <w:r>
+        <w:rPr>
+          <w:rFonts w:ascii="Arial" w:hAnsi="Arial" w:cs="Arial"/>
+          <w:lang w:val="es-ES"/>
+        </w:rPr>
+        <w:t>asc</w:t>
+      </w:r>
+      <w:proofErr w:type="spellEnd"/>
+      <w:r>
+        <w:rPr>
+          <w:rFonts w:ascii="Arial" w:hAnsi="Arial" w:cs="Arial"/>
+          <w:lang w:val="es-ES"/>
+        </w:rPr>
+        <w:t xml:space="preserve"> </w:t>
+      </w:r>
+      <w:proofErr w:type="spellStart"/>
+      <w:r>
+        <w:rPr>
+          <w:rFonts w:ascii="Arial" w:hAnsi="Arial" w:cs="Arial"/>
+          <w:lang w:val="es-ES"/>
+        </w:rPr>
+        <w:t>deixant</w:t>
+      </w:r>
+      <w:proofErr w:type="spellEnd"/>
+      <w:r>
+        <w:rPr>
+          <w:rFonts w:ascii="Arial" w:hAnsi="Arial" w:cs="Arial"/>
+          <w:lang w:val="es-ES"/>
+        </w:rPr>
+        <w:t xml:space="preserve"> </w:t>
+      </w:r>
+      <w:proofErr w:type="spellStart"/>
+      <w:r>
+        <w:rPr>
+          <w:rFonts w:ascii="Arial" w:hAnsi="Arial" w:cs="Arial"/>
+          <w:lang w:val="es-ES"/>
+        </w:rPr>
+        <w:t>na</w:t>
+      </w:r>
+      <w:proofErr w:type="spellEnd"/>
+      <w:r>
+        <w:rPr>
+          <w:rFonts w:ascii="Arial" w:hAnsi="Arial" w:cs="Arial"/>
+          <w:lang w:val="es-ES"/>
+        </w:rPr>
+        <w:t xml:space="preserve"> al final</w:t>
+      </w:r>
+    </w:p>
+    <w:p>
+      <w:pPr>
+        <w:pStyle w:val="ListParagraph"/>
+        <w:numPr>
+          <w:ilvl w:val="1"/>
+          <w:numId w:val="1"/>
+        </w:numPr>
+        <w:rPr>
+          <w:rFonts w:ascii="Arial" w:hAnsi="Arial" w:cs="Arial"/>
+          <w:lang w:val="es-ES"/>
+        </w:rPr>
+      </w:pPr>
+      <w:r>
+        <w:rPr>
+          <w:rFonts w:ascii="Arial" w:hAnsi="Arial" w:cs="Arial"/>
+          <w:lang w:val="es-ES"/>
+        </w:rPr>
+        <w:t xml:space="preserve">Restringir el </w:t>
+      </w:r>
+      <w:proofErr w:type="spellStart"/>
+      <w:r>
+        <w:rPr>
+          <w:rFonts w:ascii="Arial" w:hAnsi="Arial" w:cs="Arial"/>
+          <w:lang w:val="es-ES"/>
+        </w:rPr>
+        <w:t>conjunt</w:t>
+      </w:r>
+      <w:proofErr w:type="spellEnd"/>
+      <w:r>
+        <w:rPr>
+          <w:rFonts w:ascii="Arial" w:hAnsi="Arial" w:cs="Arial"/>
+          <w:lang w:val="es-ES"/>
+        </w:rPr>
+        <w:t xml:space="preserve"> de </w:t>
+      </w:r>
+      <w:proofErr w:type="spellStart"/>
+      <w:r>
+        <w:rPr>
+          <w:rFonts w:ascii="Arial" w:hAnsi="Arial" w:cs="Arial"/>
+          <w:lang w:val="es-ES"/>
+        </w:rPr>
+        <w:t>vertexs</w:t>
+      </w:r>
+      <w:proofErr w:type="spellEnd"/>
+      <w:r>
+        <w:rPr>
+          <w:rFonts w:ascii="Arial" w:hAnsi="Arial" w:cs="Arial"/>
+          <w:lang w:val="es-ES"/>
+        </w:rPr>
+        <w:t xml:space="preserve"> a les entrades (de </w:t>
+      </w:r>
+      <w:proofErr w:type="spellStart"/>
+      <w:r>
+        <w:rPr>
+          <w:rFonts w:ascii="Arial" w:hAnsi="Arial" w:cs="Arial"/>
+          <w:lang w:val="es-ES"/>
+        </w:rPr>
+        <w:t>weights</w:t>
+      </w:r>
+      <w:proofErr w:type="spellEnd"/>
+      <w:r>
+        <w:rPr>
+          <w:rFonts w:ascii="Arial" w:hAnsi="Arial" w:cs="Arial"/>
+          <w:lang w:val="es-ES"/>
+        </w:rPr>
+        <w:t xml:space="preserve"> </w:t>
+      </w:r>
+      <w:proofErr w:type="spellStart"/>
+      <w:r>
+        <w:rPr>
+          <w:rFonts w:ascii="Arial" w:hAnsi="Arial" w:cs="Arial"/>
+          <w:lang w:val="es-ES"/>
+        </w:rPr>
+        <w:t>suposo</w:t>
+      </w:r>
+      <w:proofErr w:type="spellEnd"/>
+      <w:r>
+        <w:rPr>
+          <w:rFonts w:ascii="Arial" w:hAnsi="Arial" w:cs="Arial"/>
+          <w:lang w:val="es-ES"/>
+        </w:rPr>
+        <w:t>)</w:t>
+      </w:r>
+    </w:p>
+    <w:p>
+      <w:pPr>
+        <w:pStyle w:val="ListParagraph"/>
+        <w:numPr>
+          <w:ilvl w:val="1"/>
+          <w:numId w:val="1"/>
+        </w:numPr>
+        <w:rPr>
+          <w:rFonts w:ascii="Arial" w:hAnsi="Arial" w:cs="Arial"/>
+          <w:lang w:val="es-ES"/>
+        </w:rPr>
+      </w:pPr>
+      <w:proofErr w:type="spellStart"/>
+      <w:r>
+        <w:rPr>
+          <w:rFonts w:ascii="Arial" w:hAnsi="Arial" w:cs="Arial"/>
+          <w:lang w:val="es-ES"/>
+        </w:rPr>
+        <w:t>Fer</w:t>
+      </w:r>
+      <w:proofErr w:type="spellEnd"/>
+      <w:r>
+        <w:rPr>
+          <w:rFonts w:ascii="Arial" w:hAnsi="Arial" w:cs="Arial"/>
+          <w:lang w:val="es-ES"/>
+        </w:rPr>
+        <w:t xml:space="preserve"> totes les </w:t>
+      </w:r>
+      <w:proofErr w:type="spellStart"/>
+      <w:r>
+        <w:rPr>
+          <w:rFonts w:ascii="Arial" w:hAnsi="Arial" w:cs="Arial"/>
+          <w:lang w:val="es-ES"/>
+        </w:rPr>
+        <w:t>combinacions</w:t>
+      </w:r>
+      <w:proofErr w:type="spellEnd"/>
+      <w:r>
+        <w:rPr>
+          <w:rFonts w:ascii="Arial" w:hAnsi="Arial" w:cs="Arial"/>
+          <w:lang w:val="es-ES"/>
+        </w:rPr>
+        <w:t xml:space="preserve"> u v de entrada a entrada</w:t>
+      </w:r>
+    </w:p>
+    <w:p>
+      <w:pPr>
+        <w:pStyle w:val="ListParagraph"/>
+        <w:numPr>
+          <w:ilvl w:val="1"/>
+          <w:numId w:val="1"/>
+        </w:numPr>
+        <w:rPr>
+          <w:rFonts w:ascii="Arial" w:hAnsi="Arial" w:cs="Arial"/>
+          <w:lang w:val="en-GB"/>
+        </w:rPr>
+      </w:pPr>
+      <w:proofErr w:type="spellStart"/>
+      <w:r>
+        <w:rPr>
+          <w:rFonts w:ascii="Arial" w:hAnsi="Arial" w:cs="Arial"/>
+          <w:lang w:val="en-GB"/>
+        </w:rPr>
+        <w:t>Executar</w:t>
+      </w:r>
+      <w:proofErr w:type="spellEnd"/>
+      <w:r>
+        <w:rPr>
+          <w:rFonts w:ascii="Arial" w:hAnsi="Arial" w:cs="Arial"/>
+          <w:lang w:val="en-GB"/>
+        </w:rPr>
+        <w:t xml:space="preserve"> cut </w:t>
+      </w:r>
+      <w:proofErr w:type="spellStart"/>
+      <w:r>
+        <w:rPr>
+          <w:rFonts w:ascii="Arial" w:hAnsi="Arial" w:cs="Arial"/>
+          <w:lang w:val="en-GB"/>
+        </w:rPr>
+        <w:t>dijkstra</w:t>
+      </w:r>
+      <w:proofErr w:type="spellEnd"/>
+      <w:r>
+        <w:rPr>
+          <w:rFonts w:ascii="Arial" w:hAnsi="Arial" w:cs="Arial"/>
+          <w:lang w:val="en-GB"/>
+        </w:rPr>
+        <w:t xml:space="preserve"> </w:t>
+      </w:r>
+      <w:proofErr w:type="spellStart"/>
+      <w:r>
+        <w:rPr>
+          <w:rFonts w:ascii="Arial" w:hAnsi="Arial" w:cs="Arial"/>
+          <w:lang w:val="en-GB"/>
+        </w:rPr>
+        <w:t>amb</w:t>
+      </w:r>
+      <w:proofErr w:type="spellEnd"/>
+      <w:r>
+        <w:rPr>
+          <w:rFonts w:ascii="Arial" w:hAnsi="Arial" w:cs="Arial"/>
+          <w:lang w:val="en-GB"/>
+        </w:rPr>
+        <w:t xml:space="preserve"> tot </w:t>
+      </w:r>
+      <w:proofErr w:type="spellStart"/>
+      <w:r>
+        <w:rPr>
+          <w:rFonts w:ascii="Arial" w:hAnsi="Arial" w:cs="Arial"/>
+          <w:lang w:val="en-GB"/>
+        </w:rPr>
+        <w:t>aixo</w:t>
+      </w:r>
+      <w:proofErr w:type="spellEnd"/>
+      <w:r>
+        <w:rPr>
+          <w:rFonts w:ascii="Arial" w:hAnsi="Arial" w:cs="Arial"/>
+          <w:lang w:val="en-GB"/>
+        </w:rPr>
+        <w:t xml:space="preserve"> (verbose none </w:t>
+      </w:r>
+      <w:proofErr w:type="spellStart"/>
+      <w:r>
+        <w:rPr>
+          <w:rFonts w:ascii="Arial" w:hAnsi="Arial" w:cs="Arial"/>
+          <w:lang w:val="en-GB"/>
+        </w:rPr>
+        <w:t>clarament</w:t>
+      </w:r>
+      <w:proofErr w:type="spellEnd"/>
+      <w:r>
+        <w:rPr>
+          <w:rFonts w:ascii="Arial" w:hAnsi="Arial" w:cs="Arial"/>
+          <w:lang w:val="en-GB"/>
+        </w:rPr>
+        <w:t>)</w:t>
+      </w:r>
+    </w:p>
+    <w:p>
+      <w:pPr>
+        <w:pStyle w:val="ListParagraph"/>
+        <w:numPr>
+          <w:ilvl w:val="1"/>
+          <w:numId w:val="1"/>
+        </w:numPr>
+        <w:rPr>
+          <w:rFonts w:ascii="Arial" w:hAnsi="Arial" w:cs="Arial"/>
+          <w:lang w:val="en-GB"/>
+        </w:rPr>
+      </w:pPr>
+      <w:proofErr w:type="spellStart"/>
+      <w:r>
+        <w:rPr>
+          <w:rFonts w:ascii="Arial" w:hAnsi="Arial" w:cs="Arial"/>
+          <w:lang w:val="en-GB"/>
+        </w:rPr>
+        <w:t>Canviar</w:t>
+      </w:r>
+      <w:proofErr w:type="spellEnd"/>
+      <w:r>
+        <w:rPr>
+          <w:rFonts w:ascii="Arial" w:hAnsi="Arial" w:cs="Arial"/>
+          <w:lang w:val="en-GB"/>
+        </w:rPr>
+        <w:t xml:space="preserve"> nom?</w:t>
+      </w:r>
+    </w:p>
+    <w:p>
+      <w:pPr>
+        <w:pStyle w:val="ListParagraph"/>
+        <w:numPr>
+          <w:ilvl w:val="1"/>
+          <w:numId w:val="1"/>
+        </w:numPr>
+        <w:rPr>
+          <w:rFonts w:ascii="Arial" w:hAnsi="Arial" w:cs="Arial"/>
+        </w:rPr>
+      </w:pPr>
+      <w:r>
+        <w:rPr>
+          <w:rFonts w:ascii="Arial" w:hAnsi="Arial" w:cs="Arial"/>
+        </w:rPr>
+        <w:t>Analysis</w:t>
+      </w:r>
+    </w:p>
+    <w:p>
+      <w:pPr>
+        <w:pStyle w:val="ListParagraph"/>
+        <w:numPr>
+          <w:ilvl w:val="2"/>
+          <w:numId w:val="1"/>
+        </w:numPr>
+        <w:rPr>
+          <w:rFonts w:ascii="Arial" w:hAnsi="Arial" w:cs="Arial"/>
+        </w:rPr>
+      </w:pPr>
+      <w:r>
+        <w:rPr>
+          <w:rFonts w:ascii="Arial" w:hAnsi="Arial" w:cs="Arial"/>
+        </w:rPr>
+        <w:lastRenderedPageBreak/>
         <w:t>Analyse where this proportion is very low (where we have to place heuristic service) and very high (equivalence classes)</w:t>
       </w:r>
     </w:p>
@@ -2994,6 +3559,205 @@
       <w:pPr>
         <w:pStyle w:val="ListParagraph"/>
         <w:numPr>
+          <w:ilvl w:val="2"/>
+          <w:numId w:val="1"/>
+        </w:numPr>
+        <w:rPr>
+          <w:rFonts w:ascii="Arial" w:hAnsi="Arial" w:cs="Arial"/>
+          <w:lang w:val="en-GB"/>
+        </w:rPr>
+      </w:pPr>
+      <w:r>
+        <w:rPr>
+          <w:rFonts w:ascii="Arial" w:hAnsi="Arial" w:cs="Arial"/>
+          <w:lang w:val="en-GB"/>
+        </w:rPr>
+        <w:t xml:space="preserve">Analysis </w:t>
+      </w:r>
+      <w:proofErr w:type="spellStart"/>
+      <w:r>
+        <w:rPr>
+          <w:rFonts w:ascii="Arial" w:hAnsi="Arial" w:cs="Arial"/>
+          <w:lang w:val="en-GB"/>
+        </w:rPr>
+        <w:t>hiphotesis</w:t>
+      </w:r>
+      <w:proofErr w:type="spellEnd"/>
+    </w:p>
+    <w:p>
+      <w:pPr>
+        <w:pStyle w:val="ListParagraph"/>
+        <w:numPr>
+          <w:ilvl w:val="3"/>
+          <w:numId w:val="1"/>
+        </w:numPr>
+        <w:rPr>
+          <w:rFonts w:ascii="Arial" w:hAnsi="Arial" w:cs="Arial"/>
+          <w:lang w:val="es-ES"/>
+        </w:rPr>
+      </w:pPr>
+      <w:proofErr w:type="spellStart"/>
+      <w:r>
+        <w:rPr>
+          <w:rFonts w:ascii="Arial" w:hAnsi="Arial" w:cs="Arial"/>
+          <w:lang w:val="es-ES"/>
+        </w:rPr>
+        <w:t>Na</w:t>
+      </w:r>
+      <w:proofErr w:type="spellEnd"/>
+      <w:r>
+        <w:rPr>
+          <w:rFonts w:ascii="Arial" w:hAnsi="Arial" w:cs="Arial"/>
+          <w:lang w:val="es-ES"/>
+        </w:rPr>
+        <w:t xml:space="preserve"> </w:t>
+      </w:r>
+      <w:proofErr w:type="spellStart"/>
+      <w:r>
+        <w:rPr>
+          <w:rFonts w:ascii="Arial" w:hAnsi="Arial" w:cs="Arial"/>
+          <w:lang w:val="es-ES"/>
+        </w:rPr>
+        <w:t>nomes</w:t>
+      </w:r>
+      <w:proofErr w:type="spellEnd"/>
+      <w:r>
+        <w:rPr>
+          <w:rFonts w:ascii="Arial" w:hAnsi="Arial" w:cs="Arial"/>
+          <w:lang w:val="es-ES"/>
+        </w:rPr>
+        <w:t xml:space="preserve"> per la de </w:t>
+      </w:r>
+      <w:proofErr w:type="spellStart"/>
+      <w:r>
+        <w:rPr>
+          <w:rFonts w:ascii="Arial" w:hAnsi="Arial" w:cs="Arial"/>
+          <w:lang w:val="es-ES"/>
+        </w:rPr>
+        <w:t>sants</w:t>
+      </w:r>
+      <w:proofErr w:type="spellEnd"/>
+      <w:r>
+        <w:rPr>
+          <w:rFonts w:ascii="Arial" w:hAnsi="Arial" w:cs="Arial"/>
+          <w:lang w:val="es-ES"/>
+        </w:rPr>
+        <w:t xml:space="preserve"> aquella</w:t>
+      </w:r>
+    </w:p>
+    <w:p>
+      <w:pPr>
+        <w:pStyle w:val="ListParagraph"/>
+        <w:numPr>
+          <w:ilvl w:val="3"/>
+          <w:numId w:val="1"/>
+        </w:numPr>
+        <w:rPr>
+          <w:rFonts w:ascii="Arial" w:hAnsi="Arial" w:cs="Arial"/>
+          <w:lang w:val="es-ES"/>
+        </w:rPr>
+      </w:pPr>
+      <w:proofErr w:type="spellStart"/>
+      <w:r>
+        <w:rPr>
+          <w:rFonts w:ascii="Arial" w:hAnsi="Arial" w:cs="Arial"/>
+          <w:lang w:val="es-ES"/>
+        </w:rPr>
+        <w:t>Prop</w:t>
+      </w:r>
+      <w:r>
+        <w:rPr>
+          <w:rFonts w:ascii="Arial" w:hAnsi="Arial" w:cs="Arial"/>
+          <w:lang w:val="es-ES"/>
+        </w:rPr>
+        <w:t>orció</w:t>
+      </w:r>
+      <w:proofErr w:type="spellEnd"/>
+      <w:r>
+        <w:rPr>
+          <w:rFonts w:ascii="Arial" w:hAnsi="Arial" w:cs="Arial"/>
+          <w:lang w:val="es-ES"/>
+        </w:rPr>
+        <w:t xml:space="preserve"> </w:t>
+      </w:r>
+      <w:proofErr w:type="spellStart"/>
+      <w:r>
+        <w:rPr>
+          <w:rFonts w:ascii="Arial" w:hAnsi="Arial" w:cs="Arial"/>
+          <w:lang w:val="es-ES"/>
+        </w:rPr>
+        <w:t>propera</w:t>
+      </w:r>
+      <w:proofErr w:type="spellEnd"/>
+      <w:r>
+        <w:rPr>
+          <w:rFonts w:ascii="Arial" w:hAnsi="Arial" w:cs="Arial"/>
+          <w:lang w:val="es-ES"/>
+        </w:rPr>
+        <w:t xml:space="preserve"> a 1 </w:t>
+      </w:r>
+      <w:proofErr w:type="spellStart"/>
+      <w:r>
+        <w:rPr>
+          <w:rFonts w:ascii="Arial" w:hAnsi="Arial" w:cs="Arial"/>
+          <w:lang w:val="es-ES"/>
+        </w:rPr>
+        <w:t>dins</w:t>
+      </w:r>
+      <w:proofErr w:type="spellEnd"/>
+      <w:r>
+        <w:rPr>
+          <w:rFonts w:ascii="Arial" w:hAnsi="Arial" w:cs="Arial"/>
+          <w:lang w:val="es-ES"/>
+        </w:rPr>
+        <w:t xml:space="preserve"> se les </w:t>
+      </w:r>
+      <w:proofErr w:type="spellStart"/>
+      <w:r>
+        <w:rPr>
+          <w:rFonts w:ascii="Arial" w:hAnsi="Arial" w:cs="Arial"/>
+          <w:lang w:val="es-ES"/>
+        </w:rPr>
+        <w:t>mateixes</w:t>
+      </w:r>
+      <w:proofErr w:type="spellEnd"/>
+      <w:r>
+        <w:rPr>
+          <w:rFonts w:ascii="Arial" w:hAnsi="Arial" w:cs="Arial"/>
+          <w:lang w:val="es-ES"/>
+        </w:rPr>
+        <w:t xml:space="preserve"> </w:t>
+      </w:r>
+      <w:proofErr w:type="spellStart"/>
+      <w:r>
+        <w:rPr>
+          <w:rFonts w:ascii="Arial" w:hAnsi="Arial" w:cs="Arial"/>
+          <w:lang w:val="es-ES"/>
+        </w:rPr>
+        <w:t>classes</w:t>
+      </w:r>
+      <w:proofErr w:type="spellEnd"/>
+      <w:r>
+        <w:rPr>
+          <w:rFonts w:ascii="Arial" w:hAnsi="Arial" w:cs="Arial"/>
+          <w:lang w:val="es-ES"/>
+        </w:rPr>
+        <w:t xml:space="preserve"> </w:t>
+      </w:r>
+      <w:proofErr w:type="spellStart"/>
+      <w:r>
+        <w:rPr>
+          <w:rFonts w:ascii="Arial" w:hAnsi="Arial" w:cs="Arial"/>
+          <w:lang w:val="es-ES"/>
+        </w:rPr>
+        <w:t>dequivalencia</w:t>
+      </w:r>
+      <w:proofErr w:type="spellEnd"/>
+    </w:p>
+    <w:p>
+      <w:pPr>
+        <w:pStyle w:val="ListParagraph"/>
+        <w:numPr>
           <w:ilvl w:val="0"/>
           <w:numId w:val="1"/>
         </w:numPr>
@@ -3087,7 +3851,6 @@
         <w:rPr>
           <w:rFonts w:ascii="Arial" w:hAnsi="Arial" w:cs="Arial"/>
         </w:rPr>
-        <w:lastRenderedPageBreak/>
         <w:t>Explicar en quines característiques en concret de les dades i el graf ens hem basat per explicar bé quins serien els pocs canvis que s’haurien de fer per aplicar el codi a un altre graf que complís amb aquestes caracterísitiques per demostrar que el codi és molt escalable</w:t>
       </w:r>
     </w:p>

</xml_diff>